<commit_message>
Model Classes in progress
</commit_message>
<xml_diff>
--- a/Отчёт.docx
+++ b/Отчёт.docx
@@ -368,13 +368,44 @@
           <w:rFonts w:ascii="Times New Roman" w:hAnsi="Times New Roman" w:cs="Times New Roman"/>
           <w:u w:val="single"/>
         </w:rPr>
-        <w:t xml:space="preserve">      Жевнерчук Д.В,</w:t>
-      </w:r>
-      <w:r>
-        <w:rPr>
-          <w:rFonts w:ascii="Times New Roman" w:hAnsi="Times New Roman" w:cs="Times New Roman"/>
-        </w:rPr>
-        <w:t>__</w:t>
+        <w:t xml:space="preserve">      </w:t>
+      </w:r>
+      <w:proofErr w:type="spellStart"/>
+      <w:r>
+        <w:rPr>
+          <w:rFonts w:ascii="Times New Roman" w:hAnsi="Times New Roman" w:cs="Times New Roman"/>
+          <w:u w:val="single"/>
+        </w:rPr>
+        <w:t>Жевнерчук</w:t>
+      </w:r>
+      <w:proofErr w:type="spellEnd"/>
+      <w:r>
+        <w:rPr>
+          <w:rFonts w:ascii="Times New Roman" w:hAnsi="Times New Roman" w:cs="Times New Roman"/>
+          <w:u w:val="single"/>
+        </w:rPr>
+        <w:t xml:space="preserve"> </w:t>
+      </w:r>
+      <w:proofErr w:type="gramStart"/>
+      <w:r>
+        <w:rPr>
+          <w:rFonts w:ascii="Times New Roman" w:hAnsi="Times New Roman" w:cs="Times New Roman"/>
+          <w:u w:val="single"/>
+        </w:rPr>
+        <w:t>Д.В,</w:t>
+      </w:r>
+      <w:r>
+        <w:rPr>
+          <w:rFonts w:ascii="Times New Roman" w:hAnsi="Times New Roman" w:cs="Times New Roman"/>
+        </w:rPr>
+        <w:t>_</w:t>
+      </w:r>
+      <w:proofErr w:type="gramEnd"/>
+      <w:r>
+        <w:rPr>
+          <w:rFonts w:ascii="Times New Roman" w:hAnsi="Times New Roman" w:cs="Times New Roman"/>
+        </w:rPr>
+        <w:t>_</w:t>
       </w:r>
     </w:p>
     <w:p>
@@ -479,7 +510,21 @@
         <w:rPr>
           <w:rFonts w:ascii="Times New Roman" w:hAnsi="Times New Roman" w:cs="Times New Roman"/>
         </w:rPr>
-        <w:t>________________         Корязин Е.А.</w:t>
+        <w:t xml:space="preserve">________________         </w:t>
+      </w:r>
+      <w:proofErr w:type="spellStart"/>
+      <w:r>
+        <w:rPr>
+          <w:rFonts w:ascii="Times New Roman" w:hAnsi="Times New Roman" w:cs="Times New Roman"/>
+        </w:rPr>
+        <w:t>Корязин</w:t>
+      </w:r>
+      <w:proofErr w:type="spellEnd"/>
+      <w:r>
+        <w:rPr>
+          <w:rFonts w:ascii="Times New Roman" w:hAnsi="Times New Roman" w:cs="Times New Roman"/>
+        </w:rPr>
+        <w:t xml:space="preserve"> Е.А.</w:t>
       </w:r>
       <w:r>
         <w:rPr>
@@ -4098,13 +4143,7 @@
         <w:t>1</w:t>
       </w:r>
       <w:r>
-        <w:t xml:space="preserve"> - паттерн ходьб</w:t>
-      </w:r>
-      <w:r>
-        <w:t>а</w:t>
-      </w:r>
-      <w:r>
-        <w:t xml:space="preserve"> Короля</w:t>
+        <w:t xml:space="preserve"> - паттерн ходьба Короля</w:t>
       </w:r>
       <w:r>
         <w:fldChar w:fldCharType="end"/>
@@ -5530,16 +5569,7 @@
           <w:sz w:val="16"/>
           <w:szCs w:val="16"/>
         </w:rPr>
-        <w:t>[1</w:t>
-      </w:r>
-      <w:r>
-        <w:rPr>
-          <w:noProof/>
-          <w:color w:val="2F5496" w:themeColor="accent1" w:themeShade="BF"/>
-          <w:sz w:val="16"/>
-          <w:szCs w:val="16"/>
-        </w:rPr>
-        <w:t>]</w:t>
+        <w:t>[1]</w:t>
       </w:r>
       <w:r>
         <w:rPr>
@@ -5760,7 +5790,15 @@
         <w:t xml:space="preserve">на нем </w:t>
       </w:r>
       <w:r>
-        <w:t>состояние игры и валидировать действия игроков.</w:t>
+        <w:t xml:space="preserve">состояние игры и </w:t>
+      </w:r>
+      <w:proofErr w:type="spellStart"/>
+      <w:r>
+        <w:t>валидировать</w:t>
+      </w:r>
+      <w:proofErr w:type="spellEnd"/>
+      <w:r>
+        <w:t xml:space="preserve"> действия игроков.</w:t>
       </w:r>
     </w:p>
     <w:p>
@@ -5927,10 +5965,6 @@
     <w:p>
       <w:pPr>
         <w:pStyle w:val="af2"/>
-        <w:rPr>
-          <w:rStyle w:val="af3"/>
-          <w:lang w:val="en-US"/>
-        </w:rPr>
       </w:pPr>
       <w:r>
         <w:rPr>
@@ -5960,7 +5994,21 @@
         <w:rPr>
           <w:shd w:val="clear" w:color="auto" w:fill="FFFFFF"/>
         </w:rPr>
-        <w:t xml:space="preserve">Model-View-Controller </w:t>
+        <w:t>Model-View-</w:t>
+      </w:r>
+      <w:proofErr w:type="spellStart"/>
+      <w:r>
+        <w:rPr>
+          <w:shd w:val="clear" w:color="auto" w:fill="FFFFFF"/>
+        </w:rPr>
+        <w:t>Controller</w:t>
+      </w:r>
+      <w:proofErr w:type="spellEnd"/>
+      <w:r>
+        <w:rPr>
+          <w:shd w:val="clear" w:color="auto" w:fill="FFFFFF"/>
+        </w:rPr>
+        <w:t xml:space="preserve"> </w:t>
       </w:r>
       <w:r>
         <w:rPr>
@@ -6055,7 +6103,6 @@
           <w:color w:val="2F5496" w:themeColor="accent1" w:themeShade="BF"/>
           <w:sz w:val="16"/>
           <w:szCs w:val="14"/>
-          <w:lang w:val="en-US"/>
         </w:rPr>
         <w:t>[2]</w:t>
       </w:r>
@@ -6069,11 +6116,12 @@
         </w:rPr>
         <w:fldChar w:fldCharType="end"/>
       </w:r>
-    </w:p>
-    <w:p>
-      <w:pPr>
-        <w:pStyle w:val="af2"/>
-      </w:pPr>
+      <w:r>
+        <w:rPr>
+          <w:rStyle w:val="af3"/>
+        </w:rPr>
+        <w:br/>
+      </w:r>
       <w:r>
         <w:t>Модель -</w:t>
       </w:r>
@@ -6095,23 +6143,24 @@
       <w:r>
         <w:t xml:space="preserve"> </w:t>
       </w:r>
-    </w:p>
-    <w:p>
-      <w:pPr>
-        <w:pStyle w:val="af2"/>
+      <w:r>
+        <w:br/>
+      </w:r>
+      <w:r>
         <w:rPr>
           <w:rFonts w:cs="Times New Roman"/>
           <w:color w:val="111111"/>
           <w:shd w:val="clear" w:color="auto" w:fill="FFFFFF"/>
         </w:rPr>
-      </w:pPr>
+        <w:t>Представление – это часть ответственная за отображение данных</w:t>
+      </w:r>
       <w:r>
         <w:rPr>
           <w:rFonts w:cs="Times New Roman"/>
           <w:color w:val="111111"/>
           <w:shd w:val="clear" w:color="auto" w:fill="FFFFFF"/>
         </w:rPr>
-        <w:t>Представление – это часть ответственная за отображение данных</w:t>
+        <w:t xml:space="preserve">. </w:t>
       </w:r>
       <w:r>
         <w:rPr>
@@ -6119,7 +6168,7 @@
           <w:color w:val="111111"/>
           <w:shd w:val="clear" w:color="auto" w:fill="FFFFFF"/>
         </w:rPr>
-        <w:t xml:space="preserve">. </w:t>
+        <w:t>П</w:t>
       </w:r>
       <w:r>
         <w:rPr>
@@ -6127,7 +6176,10 @@
           <w:color w:val="111111"/>
           <w:shd w:val="clear" w:color="auto" w:fill="FFFFFF"/>
         </w:rPr>
-        <w:t>П</w:t>
+        <w:t xml:space="preserve">редставление не может напрямую влиять на модель. </w:t>
+      </w:r>
+      <w:r>
+        <w:br/>
       </w:r>
       <w:r>
         <w:rPr>
@@ -6135,43 +6187,26 @@
           <w:color w:val="111111"/>
           <w:shd w:val="clear" w:color="auto" w:fill="FFFFFF"/>
         </w:rPr>
-        <w:t xml:space="preserve">редставление не может напрямую влиять на модель. </w:t>
-      </w:r>
-    </w:p>
-    <w:p>
-      <w:pPr>
-        <w:pStyle w:val="af2"/>
+        <w:t>Контроллер</w:t>
+      </w:r>
+      <w:r>
         <w:rPr>
           <w:rFonts w:cs="Times New Roman"/>
           <w:color w:val="111111"/>
           <w:shd w:val="clear" w:color="auto" w:fill="FFFFFF"/>
         </w:rPr>
-      </w:pPr>
+        <w:t xml:space="preserve"> </w:t>
+      </w:r>
+      <w:proofErr w:type="gramStart"/>
       <w:r>
         <w:rPr>
           <w:rFonts w:cs="Times New Roman"/>
           <w:color w:val="111111"/>
           <w:shd w:val="clear" w:color="auto" w:fill="FFFFFF"/>
         </w:rPr>
-        <w:lastRenderedPageBreak/>
-        <w:t>Контроллер</w:t>
-      </w:r>
-      <w:r>
-        <w:rPr>
-          <w:rFonts w:cs="Times New Roman"/>
-          <w:color w:val="111111"/>
-          <w:shd w:val="clear" w:color="auto" w:fill="FFFFFF"/>
-        </w:rPr>
-        <w:t xml:space="preserve"> </w:t>
-      </w:r>
-      <w:r>
-        <w:rPr>
-          <w:rFonts w:cs="Times New Roman"/>
-          <w:color w:val="111111"/>
-          <w:shd w:val="clear" w:color="auto" w:fill="FFFFFF"/>
-        </w:rPr>
         <w:t>- это</w:t>
       </w:r>
+      <w:proofErr w:type="gramEnd"/>
       <w:r>
         <w:rPr>
           <w:rFonts w:cs="Times New Roman"/>
@@ -6283,6 +6318,7 @@
           <w:color w:val="111111"/>
           <w:shd w:val="clear" w:color="auto" w:fill="FFFFFF"/>
         </w:rPr>
+        <w:lastRenderedPageBreak/>
         <w:drawing>
           <wp:inline distT="0" distB="0" distL="0" distR="0" wp14:anchorId="228E0499" wp14:editId="20892E59">
             <wp:extent cx="4822466" cy="1728390"/>
@@ -6478,6 +6514,50 @@
     </w:p>
     <w:p>
       <w:pPr>
+        <w:pStyle w:val="af2"/>
+      </w:pPr>
+      <w:r>
+        <w:t>В модели</w:t>
+      </w:r>
+      <w:r>
+        <w:t xml:space="preserve"> </w:t>
+      </w:r>
+      <w:r>
+        <w:t>должн</w:t>
+      </w:r>
+      <w:r>
+        <w:t>ы</w:t>
+      </w:r>
+      <w:r>
+        <w:t xml:space="preserve"> содержаться игровая </w:t>
+      </w:r>
+      <w:r>
+        <w:t>логика</w:t>
+      </w:r>
+      <w:r>
+        <w:t xml:space="preserve">, </w:t>
+      </w:r>
+      <w:r>
+        <w:t>и</w:t>
+      </w:r>
+      <w:r>
+        <w:t xml:space="preserve"> данные, о</w:t>
+      </w:r>
+      <w:r>
+        <w:t>п</w:t>
+      </w:r>
+      <w:r>
+        <w:t>исывающие игр</w:t>
+      </w:r>
+      <w:r>
+        <w:t>у. В рамках нашего проекта мы подразумеваем, что данные игрового мира – это игровая доска с клетками и фигурами игроков, их положение</w:t>
+      </w:r>
+      <w:r>
+        <w:t xml:space="preserve"> и состояние. Логика – это правила по которым обрабатываются ходы игроков и захватываются клетки. Паттерны ходов фигур, подсчет количества очков тоже часть логики.</w:t>
+      </w:r>
+    </w:p>
+    <w:p>
+      <w:pPr>
         <w:pStyle w:val="3"/>
         <w:numPr>
           <w:ilvl w:val="2"/>
@@ -6504,6 +6584,89 @@
     </w:p>
     <w:p>
       <w:pPr>
+        <w:pStyle w:val="af2"/>
+      </w:pPr>
+      <w:r>
+        <w:rPr>
+          <w:rStyle w:val="af3"/>
+        </w:rPr>
+        <w:t>Данный модуль состоит из нескольких систем, отвечающих за различные аспекты игровой логики, а также класса игрового состояния, агрегирующего в себе классы конкретных сущностей –</w:t>
+      </w:r>
+      <w:r>
+        <w:rPr>
+          <w:rStyle w:val="af3"/>
+        </w:rPr>
+        <w:t xml:space="preserve"> </w:t>
+      </w:r>
+      <w:r>
+        <w:rPr>
+          <w:rStyle w:val="af3"/>
+        </w:rPr>
+        <w:t>клеток, игроков</w:t>
+      </w:r>
+      <w:r>
+        <w:rPr>
+          <w:rStyle w:val="af3"/>
+        </w:rPr>
+        <w:t xml:space="preserve">, фигур. Структура модели изображена на </w:t>
+      </w:r>
+      <w:r>
+        <w:t>рисунке 3.2.</w:t>
+      </w:r>
+    </w:p>
+    <w:p>
+      <w:pPr>
+        <w:keepNext/>
+      </w:pPr>
+      <w:r>
+        <w:lastRenderedPageBreak/>
+        <w:drawing>
+          <wp:inline distT="0" distB="0" distL="0" distR="0" wp14:anchorId="324390BD" wp14:editId="0D660DC1">
+            <wp:extent cx="5597719" cy="4669652"/>
+            <wp:effectExtent l="0" t="0" r="3175" b="0"/>
+            <wp:docPr id="8" name="Рисунок 8"/>
+            <wp:cNvGraphicFramePr>
+              <a:graphicFrameLocks xmlns:a="http://schemas.openxmlformats.org/drawingml/2006/main" noChangeAspect="1"/>
+            </wp:cNvGraphicFramePr>
+            <a:graphic xmlns:a="http://schemas.openxmlformats.org/drawingml/2006/main">
+              <a:graphicData uri="http://schemas.openxmlformats.org/drawingml/2006/picture">
+                <pic:pic xmlns:pic="http://schemas.openxmlformats.org/drawingml/2006/picture">
+                  <pic:nvPicPr>
+                    <pic:cNvPr id="1" name=""/>
+                    <pic:cNvPicPr/>
+                  </pic:nvPicPr>
+                  <pic:blipFill>
+                    <a:blip r:embed="rId12"/>
+                    <a:stretch>
+                      <a:fillRect/>
+                    </a:stretch>
+                  </pic:blipFill>
+                  <pic:spPr>
+                    <a:xfrm>
+                      <a:off x="0" y="0"/>
+                      <a:ext cx="5610970" cy="4680706"/>
+                    </a:xfrm>
+                    <a:prstGeom prst="rect">
+                      <a:avLst/>
+                    </a:prstGeom>
+                  </pic:spPr>
+                </pic:pic>
+              </a:graphicData>
+            </a:graphic>
+          </wp:inline>
+        </w:drawing>
+      </w:r>
+    </w:p>
+    <w:p>
+      <w:pPr>
+        <w:pStyle w:val="af7"/>
+      </w:pPr>
+      <w:r>
+        <w:t>Рисунок 3.2. Структура модели</w:t>
+      </w:r>
+    </w:p>
+    <w:p>
+      <w:pPr>
         <w:pStyle w:val="3"/>
         <w:numPr>
           <w:ilvl w:val="2"/>
@@ -6530,6 +6693,151 @@
     </w:p>
     <w:p>
       <w:pPr>
+        <w:pStyle w:val="af2"/>
+        <w:rPr>
+          <w:rStyle w:val="af3"/>
+        </w:rPr>
+      </w:pPr>
+      <w:r>
+        <w:rPr>
+          <w:lang w:val="en-US"/>
+        </w:rPr>
+        <w:t>GameStateCalcSystem</w:t>
+      </w:r>
+      <w:r>
+        <w:t xml:space="preserve"> –</w:t>
+      </w:r>
+      <w:r>
+        <w:t xml:space="preserve"> класс, содержащий в себе статические методы для изменения текущего состояния игры</w:t>
+      </w:r>
+      <w:r>
+        <w:t>.</w:t>
+      </w:r>
+      <w:r>
+        <w:t xml:space="preserve"> </w:t>
+      </w:r>
+      <w:r>
+        <w:t>Он н</w:t>
+      </w:r>
+      <w:r>
+        <w:t>е содержит в себе данных</w:t>
+      </w:r>
+      <w:r>
+        <w:t xml:space="preserve"> и</w:t>
+      </w:r>
+      <w:r>
+        <w:t xml:space="preserve"> используется как набор </w:t>
+      </w:r>
+      <w:r>
+        <w:t>алгоритмов, создание объекта класса не подразумевается.</w:t>
+      </w:r>
+      <w:r>
+        <w:br/>
+        <w:t>Основные методы:</w:t>
+      </w:r>
+      <w:r>
+        <w:br/>
+        <w:t xml:space="preserve">- </w:t>
+      </w:r>
+      <w:r>
+        <w:rPr>
+          <w:lang w:val="en-US"/>
+        </w:rPr>
+        <w:t>Map</w:t>
+      </w:r>
+      <w:r>
+        <w:t xml:space="preserve"> </w:t>
+      </w:r>
+      <w:r>
+        <w:rPr>
+          <w:rStyle w:val="af3"/>
+        </w:rPr>
+        <w:t>UpdateGameState (</w:t>
+      </w:r>
+      <w:r>
+        <w:rPr>
+          <w:rStyle w:val="af3"/>
+        </w:rPr>
+        <w:t>Map)</w:t>
+      </w:r>
+      <w:r>
+        <w:rPr>
+          <w:rStyle w:val="af3"/>
+        </w:rPr>
+        <w:t xml:space="preserve"> </w:t>
+      </w:r>
+      <w:r>
+        <w:rPr>
+          <w:rStyle w:val="af3"/>
+        </w:rPr>
+        <w:t>метод принимает на вход игровое состояние, производит захват областей 3 на 3, и подсчитывает количество очков.</w:t>
+      </w:r>
+    </w:p>
+    <w:p>
+      <w:pPr>
+        <w:pStyle w:val="af2"/>
+        <w:ind w:firstLine="0"/>
+      </w:pPr>
+      <w:r>
+        <w:rPr>
+          <w:rStyle w:val="af3"/>
+        </w:rPr>
+        <w:t>-</w:t>
+      </w:r>
+      <w:r>
+        <w:rPr>
+          <w:lang w:val="en-US"/>
+        </w:rPr>
+        <w:t>Map</w:t>
+      </w:r>
+      <w:r>
+        <w:t xml:space="preserve"> </w:t>
+      </w:r>
+      <w:proofErr w:type="gramStart"/>
+      <w:r>
+        <w:rPr>
+          <w:lang w:val="en-US"/>
+        </w:rPr>
+        <w:t>ApplyStep</w:t>
+      </w:r>
+      <w:r>
+        <w:t>(</w:t>
+      </w:r>
+      <w:proofErr w:type="gramEnd"/>
+      <w:r>
+        <w:rPr>
+          <w:lang w:val="en-US"/>
+        </w:rPr>
+        <w:t>Map</w:t>
+      </w:r>
+      <w:r>
+        <w:t xml:space="preserve">, </w:t>
+      </w:r>
+      <w:r>
+        <w:rPr>
+          <w:lang w:val="en-US"/>
+        </w:rPr>
+        <w:t>Figure</w:t>
+      </w:r>
+      <w:r>
+        <w:t xml:space="preserve">, </w:t>
+      </w:r>
+      <w:r>
+        <w:rPr>
+          <w:lang w:val="en-US"/>
+        </w:rPr>
+        <w:t>Cell</w:t>
+      </w:r>
+      <w:r>
+        <w:t>)</w:t>
+      </w:r>
+      <w:r>
+        <w:t xml:space="preserve"> метод принимает на вход игровое состояние, фигуру, и клетку куда ходит фигура. Возвращает новое игровое состояние, входной параметр не изменяется.</w:t>
+      </w:r>
+    </w:p>
+    <w:p/>
+    <w:p>
+      <w:pPr>
         <w:pStyle w:val="2"/>
         <w:numPr>
           <w:ilvl w:val="1"/>
@@ -6550,6 +6858,7 @@
           <w:sz w:val="28"/>
           <w:szCs w:val="28"/>
         </w:rPr>
+        <w:lastRenderedPageBreak/>
         <w:t>Контроллеры</w:t>
       </w:r>
       <w:bookmarkEnd w:id="33"/>
@@ -7072,105 +7381,6 @@
                 <pic:pic xmlns:pic="http://schemas.openxmlformats.org/drawingml/2006/picture">
                   <pic:nvPicPr>
                     <pic:cNvPr id="0" name="Picture 5"/>
-                    <pic:cNvPicPr>
-                      <a:picLocks noChangeAspect="1" noChangeArrowheads="1"/>
-                    </pic:cNvPicPr>
-                  </pic:nvPicPr>
-                  <pic:blipFill>
-                    <a:blip r:embed="rId12" cstate="print">
-                      <a:extLst>
-                        <a:ext uri="{28A0092B-C50C-407E-A947-70E740481C1C}">
-                          <a14:useLocalDpi xmlns:a14="http://schemas.microsoft.com/office/drawing/2010/main" val="0"/>
-                        </a:ext>
-                      </a:extLst>
-                    </a:blip>
-                    <a:srcRect/>
-                    <a:stretch>
-                      <a:fillRect/>
-                    </a:stretch>
-                  </pic:blipFill>
-                  <pic:spPr bwMode="auto">
-                    <a:xfrm>
-                      <a:off x="0" y="0"/>
-                      <a:ext cx="2880000" cy="3014297"/>
-                    </a:xfrm>
-                    <a:prstGeom prst="rect">
-                      <a:avLst/>
-                    </a:prstGeom>
-                    <a:noFill/>
-                    <a:ln>
-                      <a:noFill/>
-                    </a:ln>
-                  </pic:spPr>
-                </pic:pic>
-              </a:graphicData>
-            </a:graphic>
-          </wp:inline>
-        </w:drawing>
-      </w:r>
-    </w:p>
-    <w:p>
-      <w:pPr>
-        <w:pStyle w:val="af7"/>
-      </w:pPr>
-      <w:bookmarkStart w:id="50" w:name="_Toc109693198"/>
-      <w:bookmarkStart w:id="51" w:name="_Ref109693425"/>
-      <w:r>
-        <w:t>Рисунок А.</w:t>
-      </w:r>
-      <w:r>
-        <w:fldChar w:fldCharType="begin"/>
-      </w:r>
-      <w:r>
-        <w:instrText xml:space="preserve"> SEQ Рисунок_А. \* ARABIC </w:instrText>
-      </w:r>
-      <w:r>
-        <w:fldChar w:fldCharType="separate"/>
-      </w:r>
-      <w:r>
-        <w:rPr>
-          <w:noProof/>
-        </w:rPr>
-        <w:t>1</w:t>
-      </w:r>
-      <w:r>
-        <w:fldChar w:fldCharType="end"/>
-      </w:r>
-      <w:r>
-        <w:t>.</w:t>
-      </w:r>
-      <w:r>
-        <w:t xml:space="preserve"> - паттерн ходьба Короля</w:t>
-      </w:r>
-      <w:bookmarkEnd w:id="50"/>
-      <w:bookmarkEnd w:id="51"/>
-    </w:p>
-    <w:p>
-      <w:pPr>
-        <w:pStyle w:val="af7"/>
-      </w:pPr>
-    </w:p>
-    <w:p>
-      <w:pPr>
-        <w:pStyle w:val="af7"/>
-      </w:pPr>
-      <w:r>
-        <w:rPr>
-          <w:noProof/>
-        </w:rPr>
-        <w:drawing>
-          <wp:inline distT="0" distB="0" distL="0" distR="0" wp14:anchorId="246AFCD6" wp14:editId="37725E55">
-            <wp:extent cx="2880000" cy="3014297"/>
-            <wp:effectExtent l="0" t="0" r="0" b="0"/>
-            <wp:docPr id="7" name="Рисунок 7"/>
-            <wp:cNvGraphicFramePr>
-              <a:graphicFrameLocks xmlns:a="http://schemas.openxmlformats.org/drawingml/2006/main" noChangeAspect="1"/>
-            </wp:cNvGraphicFramePr>
-            <a:graphic xmlns:a="http://schemas.openxmlformats.org/drawingml/2006/main">
-              <a:graphicData uri="http://schemas.openxmlformats.org/drawingml/2006/picture">
-                <pic:pic xmlns:pic="http://schemas.openxmlformats.org/drawingml/2006/picture">
-                  <pic:nvPicPr>
-                    <pic:cNvPr id="0" name="Picture 6"/>
                     <pic:cNvPicPr>
                       <a:picLocks noChangeAspect="1" noChangeArrowheads="1"/>
                     </pic:cNvPicPr>
@@ -7212,8 +7422,8 @@
       <w:pPr>
         <w:pStyle w:val="af7"/>
       </w:pPr>
-      <w:bookmarkStart w:id="52" w:name="_Toc109693199"/>
-      <w:bookmarkStart w:id="53" w:name="_Ref109693523"/>
+      <w:bookmarkStart w:id="50" w:name="_Toc109693198"/>
+      <w:bookmarkStart w:id="51" w:name="_Ref109693425"/>
       <w:r>
         <w:t>Рисунок А.</w:t>
       </w:r>
@@ -7230,7 +7440,7 @@
         <w:rPr>
           <w:noProof/>
         </w:rPr>
-        <w:t>2</w:t>
+        <w:t>1</w:t>
       </w:r>
       <w:r>
         <w:fldChar w:fldCharType="end"/>
@@ -7239,28 +7449,29 @@
         <w:t>.</w:t>
       </w:r>
       <w:r>
-        <w:t xml:space="preserve"> - Паттерн ходьбы Королевы</w:t>
-      </w:r>
-      <w:bookmarkEnd w:id="52"/>
-      <w:bookmarkEnd w:id="53"/>
-    </w:p>
-    <w:p>
-      <w:pPr>
-        <w:pStyle w:val="af2"/>
-        <w:keepNext/>
-        <w:ind w:firstLine="0"/>
-        <w:jc w:val="center"/>
+        <w:t xml:space="preserve"> - паттерн ходьба Короля</w:t>
+      </w:r>
+      <w:bookmarkEnd w:id="50"/>
+      <w:bookmarkEnd w:id="51"/>
+    </w:p>
+    <w:p>
+      <w:pPr>
+        <w:pStyle w:val="af7"/>
+      </w:pPr>
+    </w:p>
+    <w:p>
+      <w:pPr>
+        <w:pStyle w:val="af7"/>
       </w:pPr>
       <w:r>
         <w:rPr>
           <w:noProof/>
         </w:rPr>
-        <w:lastRenderedPageBreak/>
         <w:drawing>
-          <wp:inline distT="0" distB="0" distL="0" distR="0" wp14:anchorId="373746A3" wp14:editId="5E9DA0D2">
+          <wp:inline distT="0" distB="0" distL="0" distR="0" wp14:anchorId="246AFCD6" wp14:editId="37725E55">
             <wp:extent cx="2880000" cy="3014297"/>
             <wp:effectExtent l="0" t="0" r="0" b="0"/>
-            <wp:docPr id="9" name="Рисунок 9"/>
+            <wp:docPr id="7" name="Рисунок 7"/>
             <wp:cNvGraphicFramePr>
               <a:graphicFrameLocks xmlns:a="http://schemas.openxmlformats.org/drawingml/2006/main" noChangeAspect="1"/>
             </wp:cNvGraphicFramePr>
@@ -7268,7 +7479,7 @@
               <a:graphicData uri="http://schemas.openxmlformats.org/drawingml/2006/picture">
                 <pic:pic xmlns:pic="http://schemas.openxmlformats.org/drawingml/2006/picture">
                   <pic:nvPicPr>
-                    <pic:cNvPr id="0" name="Picture 8"/>
+                    <pic:cNvPr id="0" name="Picture 6"/>
                     <pic:cNvPicPr>
                       <a:picLocks noChangeAspect="1" noChangeArrowheads="1"/>
                     </pic:cNvPicPr>
@@ -7310,6 +7521,104 @@
       <w:pPr>
         <w:pStyle w:val="af7"/>
       </w:pPr>
+      <w:bookmarkStart w:id="52" w:name="_Toc109693199"/>
+      <w:bookmarkStart w:id="53" w:name="_Ref109693523"/>
+      <w:r>
+        <w:t>Рисунок А.</w:t>
+      </w:r>
+      <w:r>
+        <w:fldChar w:fldCharType="begin"/>
+      </w:r>
+      <w:r>
+        <w:instrText xml:space="preserve"> SEQ Рисунок_А. \* ARABIC </w:instrText>
+      </w:r>
+      <w:r>
+        <w:fldChar w:fldCharType="separate"/>
+      </w:r>
+      <w:r>
+        <w:rPr>
+          <w:noProof/>
+        </w:rPr>
+        <w:t>2</w:t>
+      </w:r>
+      <w:r>
+        <w:fldChar w:fldCharType="end"/>
+      </w:r>
+      <w:r>
+        <w:t>.</w:t>
+      </w:r>
+      <w:r>
+        <w:t xml:space="preserve"> - Паттерн ходьбы Королевы</w:t>
+      </w:r>
+      <w:bookmarkEnd w:id="52"/>
+      <w:bookmarkEnd w:id="53"/>
+    </w:p>
+    <w:p>
+      <w:pPr>
+        <w:pStyle w:val="af2"/>
+        <w:keepNext/>
+        <w:ind w:firstLine="0"/>
+        <w:jc w:val="center"/>
+      </w:pPr>
+      <w:r>
+        <w:rPr>
+          <w:noProof/>
+        </w:rPr>
+        <w:lastRenderedPageBreak/>
+        <w:drawing>
+          <wp:inline distT="0" distB="0" distL="0" distR="0" wp14:anchorId="373746A3" wp14:editId="5E9DA0D2">
+            <wp:extent cx="2880000" cy="3014297"/>
+            <wp:effectExtent l="0" t="0" r="0" b="0"/>
+            <wp:docPr id="9" name="Рисунок 9"/>
+            <wp:cNvGraphicFramePr>
+              <a:graphicFrameLocks xmlns:a="http://schemas.openxmlformats.org/drawingml/2006/main" noChangeAspect="1"/>
+            </wp:cNvGraphicFramePr>
+            <a:graphic xmlns:a="http://schemas.openxmlformats.org/drawingml/2006/main">
+              <a:graphicData uri="http://schemas.openxmlformats.org/drawingml/2006/picture">
+                <pic:pic xmlns:pic="http://schemas.openxmlformats.org/drawingml/2006/picture">
+                  <pic:nvPicPr>
+                    <pic:cNvPr id="0" name="Picture 8"/>
+                    <pic:cNvPicPr>
+                      <a:picLocks noChangeAspect="1" noChangeArrowheads="1"/>
+                    </pic:cNvPicPr>
+                  </pic:nvPicPr>
+                  <pic:blipFill>
+                    <a:blip r:embed="rId15" cstate="print">
+                      <a:extLst>
+                        <a:ext uri="{28A0092B-C50C-407E-A947-70E740481C1C}">
+                          <a14:useLocalDpi xmlns:a14="http://schemas.microsoft.com/office/drawing/2010/main" val="0"/>
+                        </a:ext>
+                      </a:extLst>
+                    </a:blip>
+                    <a:srcRect/>
+                    <a:stretch>
+                      <a:fillRect/>
+                    </a:stretch>
+                  </pic:blipFill>
+                  <pic:spPr bwMode="auto">
+                    <a:xfrm>
+                      <a:off x="0" y="0"/>
+                      <a:ext cx="2880000" cy="3014297"/>
+                    </a:xfrm>
+                    <a:prstGeom prst="rect">
+                      <a:avLst/>
+                    </a:prstGeom>
+                    <a:noFill/>
+                    <a:ln>
+                      <a:noFill/>
+                    </a:ln>
+                  </pic:spPr>
+                </pic:pic>
+              </a:graphicData>
+            </a:graphic>
+          </wp:inline>
+        </w:drawing>
+      </w:r>
+    </w:p>
+    <w:p>
+      <w:pPr>
+        <w:pStyle w:val="af7"/>
+      </w:pPr>
       <w:bookmarkStart w:id="54" w:name="_Ref109693143"/>
       <w:bookmarkStart w:id="55" w:name="_Toc109693200"/>
       <w:r>
@@ -7376,7 +7685,7 @@
                     </pic:cNvPicPr>
                   </pic:nvPicPr>
                   <pic:blipFill>
-                    <a:blip r:embed="rId15" cstate="print">
+                    <a:blip r:embed="rId16" cstate="print">
                       <a:extLst>
                         <a:ext uri="{28A0092B-C50C-407E-A947-70E740481C1C}">
                           <a14:useLocalDpi xmlns:a14="http://schemas.microsoft.com/office/drawing/2010/main" val="0"/>
@@ -7467,106 +7776,6 @@
                 <pic:pic xmlns:pic="http://schemas.openxmlformats.org/drawingml/2006/picture">
                   <pic:nvPicPr>
                     <pic:cNvPr id="0" name="Picture 10"/>
-                    <pic:cNvPicPr>
-                      <a:picLocks noChangeAspect="1" noChangeArrowheads="1"/>
-                    </pic:cNvPicPr>
-                  </pic:nvPicPr>
-                  <pic:blipFill>
-                    <a:blip r:embed="rId16" cstate="print">
-                      <a:extLst>
-                        <a:ext uri="{28A0092B-C50C-407E-A947-70E740481C1C}">
-                          <a14:useLocalDpi xmlns:a14="http://schemas.microsoft.com/office/drawing/2010/main" val="0"/>
-                        </a:ext>
-                      </a:extLst>
-                    </a:blip>
-                    <a:srcRect/>
-                    <a:stretch>
-                      <a:fillRect/>
-                    </a:stretch>
-                  </pic:blipFill>
-                  <pic:spPr bwMode="auto">
-                    <a:xfrm>
-                      <a:off x="0" y="0"/>
-                      <a:ext cx="2880000" cy="3014297"/>
-                    </a:xfrm>
-                    <a:prstGeom prst="rect">
-                      <a:avLst/>
-                    </a:prstGeom>
-                    <a:noFill/>
-                    <a:ln>
-                      <a:noFill/>
-                    </a:ln>
-                  </pic:spPr>
-                </pic:pic>
-              </a:graphicData>
-            </a:graphic>
-          </wp:inline>
-        </w:drawing>
-      </w:r>
-    </w:p>
-    <w:p>
-      <w:pPr>
-        <w:pStyle w:val="af7"/>
-      </w:pPr>
-      <w:bookmarkStart w:id="58" w:name="_Toc109693202"/>
-      <w:bookmarkStart w:id="59" w:name="_Ref109693551"/>
-      <w:r>
-        <w:t>Рисунок А.</w:t>
-      </w:r>
-      <w:r>
-        <w:fldChar w:fldCharType="begin"/>
-      </w:r>
-      <w:r>
-        <w:instrText xml:space="preserve"> SEQ Рисунок_А. \* ARABIC </w:instrText>
-      </w:r>
-      <w:r>
-        <w:fldChar w:fldCharType="separate"/>
-      </w:r>
-      <w:r>
-        <w:rPr>
-          <w:noProof/>
-        </w:rPr>
-        <w:t>5</w:t>
-      </w:r>
-      <w:r>
-        <w:fldChar w:fldCharType="end"/>
-      </w:r>
-      <w:r>
-        <w:t>.</w:t>
-      </w:r>
-      <w:r>
-        <w:t xml:space="preserve"> - паттерн ходьба Слона</w:t>
-      </w:r>
-      <w:bookmarkEnd w:id="58"/>
-      <w:bookmarkEnd w:id="59"/>
-    </w:p>
-    <w:p>
-      <w:pPr>
-        <w:pStyle w:val="af7"/>
-      </w:pPr>
-    </w:p>
-    <w:p>
-      <w:pPr>
-        <w:pStyle w:val="af7"/>
-        <w:keepNext/>
-      </w:pPr>
-      <w:r>
-        <w:rPr>
-          <w:noProof/>
-        </w:rPr>
-        <w:drawing>
-          <wp:inline distT="0" distB="0" distL="0" distR="0" wp14:anchorId="187DB7E4" wp14:editId="2A0451F6">
-            <wp:extent cx="2880000" cy="3014297"/>
-            <wp:effectExtent l="0" t="0" r="0" b="0"/>
-            <wp:docPr id="12" name="Рисунок 12"/>
-            <wp:cNvGraphicFramePr>
-              <a:graphicFrameLocks xmlns:a="http://schemas.openxmlformats.org/drawingml/2006/main" noChangeAspect="1"/>
-            </wp:cNvGraphicFramePr>
-            <a:graphic xmlns:a="http://schemas.openxmlformats.org/drawingml/2006/main">
-              <a:graphicData uri="http://schemas.openxmlformats.org/drawingml/2006/picture">
-                <pic:pic xmlns:pic="http://schemas.openxmlformats.org/drawingml/2006/picture">
-                  <pic:nvPicPr>
-                    <pic:cNvPr id="0" name="Picture 11"/>
                     <pic:cNvPicPr>
                       <a:picLocks noChangeAspect="1" noChangeArrowheads="1"/>
                     </pic:cNvPicPr>
@@ -7606,6 +7815,106 @@
     </w:p>
     <w:p>
       <w:pPr>
+        <w:pStyle w:val="af7"/>
+      </w:pPr>
+      <w:bookmarkStart w:id="58" w:name="_Toc109693202"/>
+      <w:bookmarkStart w:id="59" w:name="_Ref109693551"/>
+      <w:r>
+        <w:t>Рисунок А.</w:t>
+      </w:r>
+      <w:r>
+        <w:fldChar w:fldCharType="begin"/>
+      </w:r>
+      <w:r>
+        <w:instrText xml:space="preserve"> SEQ Рисунок_А. \* ARABIC </w:instrText>
+      </w:r>
+      <w:r>
+        <w:fldChar w:fldCharType="separate"/>
+      </w:r>
+      <w:r>
+        <w:rPr>
+          <w:noProof/>
+        </w:rPr>
+        <w:t>5</w:t>
+      </w:r>
+      <w:r>
+        <w:fldChar w:fldCharType="end"/>
+      </w:r>
+      <w:r>
+        <w:t>.</w:t>
+      </w:r>
+      <w:r>
+        <w:t xml:space="preserve"> - паттерн ходьба Слона</w:t>
+      </w:r>
+      <w:bookmarkEnd w:id="58"/>
+      <w:bookmarkEnd w:id="59"/>
+    </w:p>
+    <w:p>
+      <w:pPr>
+        <w:pStyle w:val="af7"/>
+      </w:pPr>
+    </w:p>
+    <w:p>
+      <w:pPr>
+        <w:pStyle w:val="af7"/>
+        <w:keepNext/>
+      </w:pPr>
+      <w:r>
+        <w:rPr>
+          <w:noProof/>
+        </w:rPr>
+        <w:drawing>
+          <wp:inline distT="0" distB="0" distL="0" distR="0" wp14:anchorId="187DB7E4" wp14:editId="2A0451F6">
+            <wp:extent cx="2880000" cy="3014297"/>
+            <wp:effectExtent l="0" t="0" r="0" b="0"/>
+            <wp:docPr id="12" name="Рисунок 12"/>
+            <wp:cNvGraphicFramePr>
+              <a:graphicFrameLocks xmlns:a="http://schemas.openxmlformats.org/drawingml/2006/main" noChangeAspect="1"/>
+            </wp:cNvGraphicFramePr>
+            <a:graphic xmlns:a="http://schemas.openxmlformats.org/drawingml/2006/main">
+              <a:graphicData uri="http://schemas.openxmlformats.org/drawingml/2006/picture">
+                <pic:pic xmlns:pic="http://schemas.openxmlformats.org/drawingml/2006/picture">
+                  <pic:nvPicPr>
+                    <pic:cNvPr id="0" name="Picture 11"/>
+                    <pic:cNvPicPr>
+                      <a:picLocks noChangeAspect="1" noChangeArrowheads="1"/>
+                    </pic:cNvPicPr>
+                  </pic:nvPicPr>
+                  <pic:blipFill>
+                    <a:blip r:embed="rId18" cstate="print">
+                      <a:extLst>
+                        <a:ext uri="{28A0092B-C50C-407E-A947-70E740481C1C}">
+                          <a14:useLocalDpi xmlns:a14="http://schemas.microsoft.com/office/drawing/2010/main" val="0"/>
+                        </a:ext>
+                      </a:extLst>
+                    </a:blip>
+                    <a:srcRect/>
+                    <a:stretch>
+                      <a:fillRect/>
+                    </a:stretch>
+                  </pic:blipFill>
+                  <pic:spPr bwMode="auto">
+                    <a:xfrm>
+                      <a:off x="0" y="0"/>
+                      <a:ext cx="2880000" cy="3014297"/>
+                    </a:xfrm>
+                    <a:prstGeom prst="rect">
+                      <a:avLst/>
+                    </a:prstGeom>
+                    <a:noFill/>
+                    <a:ln>
+                      <a:noFill/>
+                    </a:ln>
+                  </pic:spPr>
+                </pic:pic>
+              </a:graphicData>
+            </a:graphic>
+          </wp:inline>
+        </w:drawing>
+      </w:r>
+    </w:p>
+    <w:p>
+      <w:pPr>
         <w:pStyle w:val="af5"/>
         <w:jc w:val="center"/>
       </w:pPr>
@@ -7689,7 +7998,7 @@
           <w:numId w:val="10"/>
         </w:numPr>
       </w:pPr>
-      <w:hyperlink r:id="rId18" w:history="1">
+      <w:hyperlink r:id="rId19" w:history="1">
         <w:r>
           <w:rPr>
             <w:rStyle w:val="a9"/>
@@ -7707,7 +8016,7 @@
           <w:numId w:val="10"/>
         </w:numPr>
       </w:pPr>
-      <w:hyperlink r:id="rId19" w:history="1">
+      <w:hyperlink r:id="rId20" w:history="1">
         <w:bookmarkStart w:id="62" w:name="_Ref109694552"/>
         <w:r>
           <w:rPr>
@@ -7859,8 +8168,8 @@
       </w:pPr>
     </w:p>
     <w:sectPr>
-      <w:footerReference w:type="default" r:id="rId20"/>
-      <w:footerReference w:type="first" r:id="rId21"/>
+      <w:footerReference w:type="default" r:id="rId21"/>
+      <w:footerReference w:type="first" r:id="rId22"/>
       <w:pgSz w:w="11906" w:h="16838"/>
       <w:pgMar w:top="1134" w:right="850" w:bottom="1134" w:left="1701" w:header="708" w:footer="708" w:gutter="0"/>
       <w:pgNumType w:start="4"/>
@@ -9396,7 +9705,6 @@
   <w:style w:type="character" w:default="1" w:styleId="a0">
     <w:name w:val="Default Paragraph Font"/>
     <w:uiPriority w:val="1"/>
-    <w:semiHidden/>
     <w:unhideWhenUsed/>
   </w:style>
   <w:style w:type="table" w:default="1" w:styleId="a1">

</xml_diff>